<commit_message>
Check modeli i komentarzy: korekta liczb w komentarzach Everest, adnotacja o aktualności Sekcja_K6
Co-Authored-By: Claude Sonnet 5.5 <noreply@anthropic.com>
Claude-Session: https://claude.ai/code/session_01672WnJhixnEcarbb7uiwfx
</commit_message>
<xml_diff>
--- a/Komentarze_model_finansowy_Everest.docx
+++ b/Komentarze_model_finansowy_Everest.docx
@@ -2279,7 +2279,7 @@
         <w:rPr>
           <w:b w:val="0"/>
         </w:rPr>
-        <w:t>Prognozę przychodów dotychczasowej działalności oparto na dwukrotności wyniku pierwszego półrocza 2026 r., czyli 2 x 9 763 418 zł = 19 526 835 zł rocznie, utrzymanej na stałym poziomie do 2039 r. bez zakładania wzrostu. Przychody wykazano w jednej pozycji zbiorczej (usługi spedycyjno-transportowe), co dopuszcza Instrukcja, a ilość równa 1 oznacza, że cena jednostkowa jest równa wartości rocznej. Prognoza jest o 37% wyższa niż przychód 2025 r. (14 254 tys. zł), ponieważ przenosi na cały rok poziom obrotów z 2026 r., a nie dlatego, że założono dalszy wzrost. Obroty z 2026 r. są stabilne w kolejnych kwartałach (około 5,05 mln zł w I kwartale i około 4,71 mln zł w II kwartale), a prognoza jest o 3,3% niższa niż wynik mnożenia I kwartału przez cztery (20 204 tys. zł). Przychody z lat 2023 i 2024 (1 167 i 777 tys. zł) odpowiadają znacznie mniejszej skali działalności, opisanej w arkuszu Sprawozdania finansowe.</w:t>
+        <w:t>Prognozę przychodów dotychczasowej działalności oparto na dwukrotności wyniku pierwszego półrocza 2026 r., czyli 2 x 9 763 418 zł = 19 526 836 zł rocznie, utrzymanej na stałym poziomie do 2039 r. bez zakładania wzrostu. Przychody wykazano w jednej pozycji zbiorczej (usługi spedycyjno-transportowe), co dopuszcza Instrukcja, a ilość równa 1 oznacza, że cena jednostkowa jest równa wartości rocznej. Prognoza jest o 37% wyższa niż przychód 2025 r. (14 254 tys. zł), ponieważ przenosi na cały rok poziom obrotów z 2026 r., a nie dlatego, że założono dalszy wzrost. Obroty z 2026 r. są stabilne w kolejnych kwartałach (około 5,05 mln zł w I kwartale i około 4,71 mln zł w II kwartale), a prognoza jest o 3,3% niższa niż wynik mnożenia I kwartału przez cztery (20 204 tys. zł). Przychody z lat 2023 i 2024 (1 167 i 777 tys. zł) odpowiadają znacznie mniejszej skali działalności, opisanej w arkuszu Sprawozdania finansowe.</w:t>
       </w:r>
     </w:p>
     <w:p>
@@ -2395,7 +2395,7 @@
         <w:rPr>
           <w:b w:val="0"/>
         </w:rPr>
-        <w:t>Koszty dotychczasowej działalności przyjęto na poziomie dwukrotności pierwszego półrocza 2026 r. (2 x 9 144 948 zł = 18 289 895 zł rocznie), utrzymanym płasko bez wzrostu skali, co jest spójne z prognozą przychodów. Dominują usługi obce (17 769 tys. zł rocznie, 97% kosztów), czyli zakupy usług transportowych i spedycyjnych, a dalej wynagrodzenia (410 tys. zł), składki (85 tys. zł) oraz zużycie materiałów i energii (25 tys. zł). Zespół dotychczasowej działalności wykazano zbiorczo w jednej pozycji, co dopuszcza Instrukcja. Około 95% zakupów usług pochodzi od Natanek Logistics, a pozostałe od kilku dostawców usług spedycyjnych, doradczych i oprogramowania. Zysk ze sprzedaży wynosi 1 238 tys. zł rocznie (6,3% przychodu), tak jak w pierwszym półroczu 2026 r.</w:t>
+        <w:t>Koszty dotychczasowej działalności przyjęto na poziomie dwukrotności pierwszego półrocza 2026 r. (2 x 9 144 948 zł = 18 289 896 zł rocznie), utrzymanym płasko bez wzrostu skali, co jest spójne z prognozą przychodów. Dominują usługi obce (17 769 tys. zł rocznie, 97% kosztów), czyli zakupy usług transportowych i spedycyjnych, a dalej wynagrodzenia (410 tys. zł), składki (85 tys. zł) oraz zużycie materiałów i energii (25 tys. zł). Zespół dotychczasowej działalności wykazano zbiorczo w jednej pozycji, co dopuszcza Instrukcja. Około 95% zakupów usług pochodzi od Natanek Logistics, a pozostałe od kilku dostawców usług spedycyjnych, doradczych i oprogramowania. Zysk ze sprzedaży wynosi 1 238 tys. zł rocznie (6,3% przychodu), tak jak w pierwszym półroczu 2026 r.</w:t>
       </w:r>
     </w:p>
     <w:p>
@@ -2692,7 +2692,7 @@
         <w:rPr>
           <w:b w:val="0"/>
         </w:rPr>
-        <w:t>Dla projektu rotacje przyjęto w arkuszu Założenia: należności 45 dni, zobowiązania 30 dni i zapasy 30 dni od 2030 r. Kapitał pracujący projektu rośnie z 60 tys. zł w 2030 r. do 906 tys. zł w 2034 r. wraz ze wzrostem przychodów (490-7 347 tys. zł), a jego zmiana (od -73 tys. zł w 2030 r. do -453 tys. zł w 2034 r.) jest ujęta w przepływach w arkuszu Opłacalność. W 2034 r. należności projektu wynoszą 906 tys. zł, a zapasy komponentów i zobowiązania po 367 tys. zł. Dla całego przedsiębiorstwa kapitał pracujący wynosi 505 tys. zł w 2026 r. i 1 432 tys. zł w 2034 r., a jego wzrost finansuje rosnąca nadwyżka środków pieniężnych (4 562 tys. zł w 2030 r. i 11 423 tys. zł w 2034 r.).</w:t>
+        <w:t>Dla projektu rotacje przyjęto w arkuszu Założenia: należności 45 dni, zobowiązania 30 dni i zapasy 30 dni od 2030 r. Kapitał pracujący projektu rośnie z 60 tys. zł w 2030 r. do 906 tys. zł w 2034 r. wraz ze wzrostem przychodów (490-7 347 tys. zł), a jego zmiana (od -71 tys. zł w 2030 r. do -453 tys. zł w 2034 r.) jest ujęta w przepływach w arkuszu Opłacalność. W 2034 r. należności projektu wynoszą 906 tys. zł, a zapasy komponentów i zobowiązania po 367 tys. zł. Dla całego przedsiębiorstwa kapitał pracujący wynosi 505 tys. zł w 2026 r. i 1 432 tys. zł w 2034 r., a jego wzrost finansuje rosnąca nadwyżka środków pieniężnych (4 562 tys. zł w 2030 r. i 11 423 tys. zł w 2034 r.).</w:t>
       </w:r>
     </w:p>
     <w:p>

</xml_diff>

<commit_message>
K2-13: jednostkowy koszt wytworzenia produktów w komentarzu Koszty operacyjne (Everest); D53 zatwierdzona
Co-Authored-By: Claude Sonnet 5.5 <noreply@anthropic.com>
Claude-Session: https://claude.ai/code/session_01672WnJhixnEcarbb7uiwfx
</commit_message>
<xml_diff>
--- a/Komentarze_model_finansowy_Everest.docx
+++ b/Komentarze_model_finansowy_Everest.docx
@@ -1207,7 +1207,7 @@
         <w:rPr>
           <w:b w:val="0"/>
         </w:rPr>
-        <w:t>Wszystkie uwagi K6-01 do K6-18 dotyczą modelu Lidera, z wyjątkiem K6-17 (PRz, odpowiedź w komentarzach PRz). Uwagi o cenach i kosztach komponentów (K2-12, K2-13, K2-14, K2-16) są w komentarzach Przychody i Koszty operacyjne.</w:t>
+        <w:t>Wszystkie uwagi K6-01 do K6-18 dotyczą modelu Lidera, z wyjątkiem K6-17 (PRz, odpowiedź w komentarzach PRz). Uwagi o cenach i kosztach (K2-12, K2-13, K2-14, K2-16) są w komentarzach Przychody i Koszty operacyjne.</w:t>
       </w:r>
     </w:p>
     <w:tbl>
@@ -1621,6 +1621,53 @@
                 <w:sz w:val="18"/>
               </w:rPr>
               <w:t>Koszty operacyjne: pięć grup kosztów z kalkulacją (stawki, godziny, oferty, ryczałt), zgodność z budżetem wniosku do złotówki.</w:t>
+            </w:r>
+          </w:p>
+        </w:tc>
+      </w:tr>
+      <w:tr>
+        <w:tc>
+          <w:tcPr>
+            <w:tcW w:type="dxa" w:w="1020"/>
+          </w:tcPr>
+          <w:p>
+            <w:r/>
+            <w:r>
+              <w:rPr>
+                <w:b w:val="0"/>
+                <w:sz w:val="18"/>
+              </w:rPr>
+              <w:t>K2-13</w:t>
+            </w:r>
+          </w:p>
+        </w:tc>
+        <w:tc>
+          <w:tcPr>
+            <w:tcW w:type="dxa" w:w="3175"/>
+          </w:tcPr>
+          <w:p>
+            <w:r/>
+            <w:r>
+              <w:rPr>
+                <w:b w:val="0"/>
+                <w:sz w:val="18"/>
+              </w:rPr>
+              <w:t>Doprecyzować jednostkowy koszt wytworzenia nowego produktu i sposób wyliczenia (Koszty operacyjne)</w:t>
+            </w:r>
+          </w:p>
+        </w:tc>
+        <w:tc>
+          <w:tcPr>
+            <w:tcW w:type="dxa" w:w="5556"/>
+          </w:tcPr>
+          <w:p>
+            <w:r/>
+            <w:r>
+              <w:rPr>
+                <w:b w:val="0"/>
+                <w:sz w:val="18"/>
+              </w:rPr>
+              <w:t>Koszty operacyjne, ostatni akapit: koszt sprzętu zestawu 4 875 zł (zatwierdzony), koszt montażu jako koszt zespołu wdrożeniowego (640-2 916 zł na zestaw), koszt zmienny subskrypcji (65,7 zł za pojazd miesięcznie) i licencji API (696 zł), pełny koszt zestawu w latach 2030-2034.</w:t>
             </w:r>
           </w:p>
         </w:tc>
@@ -2384,7 +2431,7 @@
           <w:color w:val="666666"/>
           <w:sz w:val="17"/>
         </w:rPr>
-        <w:t xml:space="preserve"> [6859 znaków]</w:t>
+        <w:t xml:space="preserve"> [8770 znaków]</w:t>
       </w:r>
     </w:p>
     <w:p>
@@ -2488,6 +2535,17 @@
           <w:b w:val="0"/>
         </w:rPr>
         <w:t>Zespół komercjalizacji kosztuje 346 tys. zł w 2030 r., a następnie 461, 576, 806 i 1 037 tys. zł do 2034 r., co odpowiada 1,5; 2,0; 2,5; 3,5 i 4,5 etatu przy koszcie 19,2 tys. zł miesięcznie na etat (etaty lub współpraca B2B). Tworzą go doradcy klienta B2B (1,0 etatu w latach 2030-2032, 2,0 w 2033 r. i 3,0 w 2034 r.) oraz specjalista ds. wdrożeń (0,5 etatu w 2030 r., 1,0 w 2031 r. i 1,5 od 2032 r.). Stawka mieści się w widełkach doradcy klienta MŚP (ok. 13 000 zł brutto) i key account managera B2B (ok. 19 000 zł brutto) według Hays Salary Guide 2026. Liczba pojazdów na jeden etat rośnie z 33 w 2030 r. do 222 w 2034 r.</w:t>
+      </w:r>
+    </w:p>
+    <w:p>
+      <w:pPr>
+        <w:spacing w:after="60"/>
+      </w:pPr>
+      <w:r>
+        <w:rPr>
+          <w:b w:val="0"/>
+        </w:rPr>
+        <w:t>Jednostkowy koszt wytworzenia produktów (K2-13). Zestaw retrofit (cena 7 500 zł): koszt sprzętu wynosi 4 875 zł (dziewięć komponentów wymienionych wyżej), co w modelu daje wiersz kosztu własnego sprzętu równy liczbie zestawów razy 4,875 tys. zł (50 x 4,875 = 243,75 tys. zł w 2030 r. i 540 x 4,875 = 2 632,5 tys. zł w 2034 r.), a marża na sprzęcie wynosi 2 625 zł (35% ceny). Montaż i uruchomienie u klienta wykonuje specjalista ds. wdrożeń z zespołu komercjalizacji (koszt 230,4 tys. zł rocznie na etat), więc ten koszt jest w wierszu zespołu, a nie w koszcie sprzętu. Przypisany w całości do sprzedanych zestawów wynosi 2 304 zł na zestaw w 2030 r. (0,5 etatu i 50 zestawów), 2 916 zł w 2031 r. (1,0 etatu i 79 zestawów), 2 560 zł w 2032 r. (1,5 etatu i 135 zestawów), 1 280 zł w 2033 r. (270 zestawów) i 640 zł w 2034 r. (540 zestawów). Jest to górna granica, bo ten sam specjalista prowadzi także wdrożenia subskrypcji i licencji API. Pełny koszt zestawu ze sprzętem i montażem wynosi więc 7 179 zł w 2030 r., 7 791 zł w 2031 r., 7 435 zł w 2032 r., 6 155 zł w 2033 r. i 5 515 zł w 2034 r. (74% ceny). W latach 2030-2032 jest on bliski ceny albo ją przekracza, bo wolumen sprzedaży jest jeszcze mały wobec stałego kosztu etatu, co jest jedną z przyczyn deficytu w latach 2030-2031. Subskrypcja SaaS (349 zł za pojazd miesięcznie): koszt zmienny wynosi 65,7 zł (hosting 50 zł, marketing 1,5% ceny, czyli 5,2 zł, administracja 3% ceny, czyli 10,5 zł), więc marża zmienna to 81%. Licencja API (4 800 zł rocznie za umowę): koszt zmienny wynosi 696 zł (obsługa 480 zł, marketing 72 zł, administracja 144 zł), więc marża zmienna to 85%. Koszt sprzętu 4 875 zł jest kosztem docelowym zestawu produkcyjnego, zatwierdzonym przez Everest11 do modelu; tylko cena modułu edge AI pochodzi z cennika producenta, a pozostałe ceny komponentów są założeniami dla klasy OEM, które Everest11 potwierdzi ofertami w zadaniu Z7.</w:t>
       </w:r>
     </w:p>
     <w:p>

</xml_diff>

<commit_message>
Koszty operacyjne (Everest): usunięte powtórzenie opisu kosztu zestawu, scalony akapit kosztu jednostkowego
Co-Authored-By: Claude Sonnet 5.5 <noreply@anthropic.com>
Claude-Session: https://claude.ai/code/session_01672WnJhixnEcarbb7uiwfx
</commit_message>
<xml_diff>
--- a/Komentarze_model_finansowy_Everest.docx
+++ b/Komentarze_model_finansowy_Everest.docx
@@ -2431,7 +2431,7 @@
           <w:color w:val="666666"/>
           <w:sz w:val="17"/>
         </w:rPr>
-        <w:t xml:space="preserve"> [8770 znaków]</w:t>
+        <w:t xml:space="preserve"> [8310 znaków]</w:t>
       </w:r>
     </w:p>
     <w:p>
@@ -2453,20 +2453,7 @@
         <w:rPr>
           <w:b w:val="0"/>
         </w:rPr>
-        <w:t xml:space="preserve">Koszty projektu w fazie B+R obejmują pięć grup zgodnych z budżetem wniosku. Pierwszą są wynagrodzenia zespołu badawczego Lidera wraz ze składkami pracodawcy (200, 1 192, 1 211 i 407 tys. zł w latach 2026-2029, razem około 3 010 tys. zł) dla siedmiu stanowisk i trzech anotatorów. Wymiar zatrudnienia wynosi 0,75 etatu dla AI Lead i AI Senior Engineer, 0,25 dla Cybersecurity / AI Act Specialist, 1,0 dla IT Specialist, 0,5 dla IoT Specialist i specjalisty ds. logistyki TSL, 1,0 dla Backend/Full-Stack Developera oraz 3,0 dla anotatorów przez 10 miesięcy. Miesięczne wynagrodzenia brutto wynoszą od 6 tys. zł (anotator) do 23 tys. zł (AI Lead), a narzut pracodawcy 20,5% (składki pracodawcy: emerytalna 9,76%, rentowa 6,50%, wypadkowa 1,67%, Fundusz Pracy 2,45% i FGŚP 0,10%, razem 20,48%) </w:t>
-      </w:r>
-      <w:r>
-        <w:rPr>
-          <w:b w:val="0"/>
-          <w:highlight w:val="yellow"/>
-        </w:rPr>
-        <w:t>potwierdzić stawkę składki wypadkowej Everest11</w:t>
-      </w:r>
-      <w:r>
-        <w:rPr>
-          <w:b w:val="0"/>
-        </w:rPr>
-        <w:t>. Stawki oparto na raportach No Fluff Jobs Rynek pracy IT 2025/2026 i Hays Salary Guide 2026, a uzasadnienie każdej z nich zawiera pole Metoda szacowania odpowiedniej pozycji wniosku. Wynagrodzenia kierownika B+R, kierownika zarządzającego i zastępcy kierownika zarządzającego ujęto w kosztach pośrednich.</w:t>
+        <w:t>Koszty projektu w fazie B+R obejmują pięć grup zgodnych z budżetem wniosku. Pierwszą są wynagrodzenia zespołu badawczego Lidera wraz ze składkami pracodawcy (200, 1 192, 1 211 i 407 tys. zł w latach 2026-2029, razem około 3 010 tys. zł) dla siedmiu stanowisk i trzech anotatorów. Wymiar zatrudnienia wynosi 0,75 etatu dla AI Lead i AI Senior Engineer, 0,25 dla Cybersecurity / AI Act Specialist, 1,0 dla IT Specialist, 0,5 dla IoT Specialist i specjalisty ds. logistyki TSL, 1,0 dla Backend/Full-Stack Developera oraz 3,0 dla anotatorów przez 10 miesięcy. Miesięczne wynagrodzenia brutto wynoszą od 6 tys. zł (anotator) do 23 tys. zł (AI Lead), a narzut pracodawcy 20,5% (składki pracodawcy: emerytalna 9,76%, rentowa 6,50%, wypadkowa 1,67%, Fundusz Pracy 2,45% i FGŚP 0,10%, razem 20,48%). Stawki oparto na raportach No Fluff Jobs Rynek pracy IT 2025/2026 i Hays Salary Guide 2026, a uzasadnienie każdej z nich zawiera pole Metoda szacowania odpowiedniej pozycji wniosku. Wynagrodzenia kierownika B+R, kierownika zarządzającego i zastępcy kierownika zarządzającego ujęto w kosztach pośrednich.</w:t>
       </w:r>
     </w:p>
     <w:p>
@@ -2477,20 +2464,7 @@
         <w:rPr>
           <w:b w:val="0"/>
         </w:rPr>
-        <w:t xml:space="preserve">Drugą grupą jest podwykonawstwo montażu i demontażu zestawów na trzech pojazdach floty testowej: 150 tys. zł w 2027 r. dla toru pomiarowego w zadaniu Z2 (600 godzin po 250 zł) i 70 tys. zł w 2028 r. dla zestawów prototypowych w zadaniu Z9 (280 godzin po 250 zł). Obie kwoty są średnią z trzech ofert: Cadway-Automotive (02.06.2026), RLE VESOFTX (08.06.2026) i BEISSBARTH EQUIPMENT (10.06.2026), czyli 172 500, 142 500 i 135 000 zł dla Z2 oraz 80 500, 66 500 i 63 000 zł dla Z9. Trzecią grupą są wydatki na internacjonalizację (58 tys. zł w 2028 r. i 29 tys. zł w 2029 r., razem 86,9 tys. zł kwalifikowalnych): promocja na rynkach CEE (Z10, 55 586 zł) i zgłoszenie patentowe w EPO (Z11, 31 285 zł), dofinansowane w 50% (43 435,50 zł). Z10 obejmuje stoisko na kongresie TRANSLOG Connect Congress w Budapeszcie w listopadzie 2028 r. (opłata za powierzchnię 13 735 zł, energia, zabudowa i meble 10 184 zł, element wizualny 1 200 zł), doradztwo w wymiarze 14 dni (14 dni x 8 h x 125 zł = 14 000 zł) oraz trzy wyjazdy (dwie osoby na kongres i jedna na misję do Czech w 2029 r.) rozliczone stawką jednostkową 5 489 zł na osobę (16 467 zł). Z11 obejmuje wstępne orzeczenie rzecznika patentowego (8 000 zł), dokumentację i zgłoszenie do EPO wraz z tłumaczeniem (15 500 zł) oraz opłaty urzędowe EPO (7 785 zł). W 2028 r. ujęto stoisko, doradztwo, wyjazdy na kongres i orzeczenie rzecznika, a w 2029 r. misję do Czech, dokumentację i zgłoszenie oraz opłaty EPO (do 30.04.2029 r.) </w:t>
-      </w:r>
-      <w:r>
-        <w:rPr>
-          <w:b w:val="0"/>
-          <w:highlight w:val="yellow"/>
-        </w:rPr>
-        <w:t>potwierdzić, że doradztwo i orzeczenie rzecznika przypadają na 2028 r.</w:t>
-      </w:r>
-      <w:r>
-        <w:rPr>
-          <w:b w:val="0"/>
-        </w:rPr>
-        <w:t>. Czwartą grupą jest aparatura badawcza (57,1 tys. zł, siedem pozycji), odpisywana jednorazowo w 2027 r. w miesiącu oddania do używania (M7, maj 2027 r.) i ujęta w pozycji Zużycie materiałów i energii (Projekt) z dofinansowaniem 80% (zob. komentarz do arkusza Środki trwałe). Piątą grupą są koszty pośrednie w formie ryczałtu 25% (765 tys. zł w latach 2026-2029), liczonego od kosztów bezpośrednich (wynagrodzenia i amortyzacja aparatury, bez podwykonawstwa) zgodnie z Przewodnikiem kwalifikowalności i ujętego w pozycji pozostałe koszty rodzajowe, jak wymaga uwaga 4 do arkusza w Instrukcji.</w:t>
+        <w:t>Drugą grupą jest podwykonawstwo montażu i demontażu zestawów na trzech pojazdach floty testowej: 150 tys. zł w 2027 r. dla toru pomiarowego w zadaniu Z2 (600 godzin po 250 zł) i 70 tys. zł w 2028 r. dla zestawów prototypowych w zadaniu Z9 (280 godzin po 250 zł). Obie kwoty są średnią z trzech ofert: Cadway-Automotive (02.06.2026), RLE VESOFTX (08.06.2026) i BEISSBARTH EQUIPMENT (10.06.2026), czyli 172 500, 142 500 i 135 000 zł dla Z2 oraz 80 500, 66 500 i 63 000 zł dla Z9. Trzecią grupą są wydatki na internacjonalizację (58 tys. zł w 2028 r. i 29 tys. zł w 2029 r., razem 86,9 tys. zł kwalifikowalnych): promocja na rynkach CEE (Z10, 55 586 zł) i zgłoszenie patentowe w EPO (Z11, 31 285 zł), dofinansowane w 50% (43 435,50 zł). Z10 obejmuje stoisko na kongresie TRANSLOG Connect Congress w Budapeszcie w listopadzie 2028 r. (opłata za powierzchnię 13 735 zł, energia, zabudowa i meble 10 184 zł, element wizualny 1 200 zł), doradztwo w wymiarze 14 dni (14 dni x 8 h x 125 zł = 14 000 zł) oraz trzy wyjazdy (dwie osoby na kongres i jedna na misję do Czech w 2029 r.) rozliczone stawką jednostkową 5 489 zł na osobę (16 467 zł). Z11 obejmuje wstępne orzeczenie rzecznika patentowego (8 000 zł), dokumentację i zgłoszenie do EPO wraz z tłumaczeniem (15 500 zł) oraz opłaty urzędowe EPO (7 785 zł). W 2028 r. ujęto stoisko, doradztwo, wyjazdy na kongres i orzeczenie rzecznika, a w 2029 r. misję do Czech, dokumentację i zgłoszenie oraz opłaty EPO (do 30.04.2029 r.). Czwartą grupą jest aparatura badawcza (57,1 tys. zł, siedem pozycji), odpisywana jednorazowo w 2027 r. w miesiącu oddania do używania (M7, maj 2027 r.) i ujęta w pozycji Zużycie materiałów i energii (Projekt) z dofinansowaniem 80% (zob. komentarz do arkusza Środki trwałe). Piątą grupą są koszty pośrednie w formie ryczałtu 25% (765 tys. zł w latach 2026-2029), liczonego od kosztów bezpośrednich (wynagrodzenia i amortyzacja aparatury, bez podwykonawstwa) zgodnie z Przewodnikiem kwalifikowalności i ujętego w pozycji pozostałe koszty rodzajowe, jak wymaga uwaga 4 do arkusza w Instrukcji.</w:t>
       </w:r>
     </w:p>
     <w:p>
@@ -2523,7 +2497,7 @@
         <w:rPr>
           <w:b w:val="0"/>
         </w:rPr>
-        <w:t>Koszty zmienne przyjęto jako założenia kalkulacyjne spółki. Hosting i infrastruktura SaaS kosztują 50 zł za pojazd miesięcznie (438 tys. zł w 2034 r.), obsługa licencji API 10% jej ceny (480 zł za umowę), marketing 1,5% przychodów, a administracja i pozostałe koszty komercjalizacji 3% przychodów. Koszt komponentów zestawu retrofit wynosi 4 875 zł za zestaw, czyli 65% ceny 7 500 zł, jako koszt docelowy zestawu produkcyjnego z jednym modułem kamery ToF, kamery EO i radaru mmWave. Składają się na niego: moduł edge AI Jetson Orin Nano 8 GB 1 520 zł (cena producenta 399 USD przy zamówieniu od 1000 szt.), płyta nośna i integracja 450 zł, kamera ToF 850 zł, kamera EO 380 zł, radar mmWave 430 zł, IMU i czujniki środowiskowe 120 zł, moduł LTE/GNSS 340 zł, dysk NVMe 260 zł oraz obudowa IP66 z okablowaniem i zasilaniem 525 zł. Cena modułu edge AI pochodzi z cennika producenta, a pozostałe ceny to założenia dla modułów klasy OEM, które Everest11 potwierdzi ofertami w zadaniu Z7. Przy koszcie wyższym o 1 000 zł marża brutto na zestawie spada z 35% do 22%.</w:t>
+        <w:t>Koszty zmienne przyjęto jako założenia kalkulacyjne spółki. Hosting i infrastruktura SaaS kosztują 50 zł za pojazd miesięcznie (438 tys. zł w 2034 r.), obsługa licencji API 10% jej ceny (480 zł za umowę), marketing 1,5% przychodów, a administracja i pozostałe koszty komercjalizacji 3% przychodów. Koszt jednostkowy zestawu retrofit opisano w ostatnim akapicie.</w:t>
       </w:r>
     </w:p>
     <w:p>
@@ -2545,7 +2519,7 @@
         <w:rPr>
           <w:b w:val="0"/>
         </w:rPr>
-        <w:t>Jednostkowy koszt wytworzenia produktów (K2-13). Zestaw retrofit (cena 7 500 zł): koszt sprzętu wynosi 4 875 zł (dziewięć komponentów wymienionych wyżej), co w modelu daje wiersz kosztu własnego sprzętu równy liczbie zestawów razy 4,875 tys. zł (50 x 4,875 = 243,75 tys. zł w 2030 r. i 540 x 4,875 = 2 632,5 tys. zł w 2034 r.), a marża na sprzęcie wynosi 2 625 zł (35% ceny). Montaż i uruchomienie u klienta wykonuje specjalista ds. wdrożeń z zespołu komercjalizacji (koszt 230,4 tys. zł rocznie na etat), więc ten koszt jest w wierszu zespołu, a nie w koszcie sprzętu. Przypisany w całości do sprzedanych zestawów wynosi 2 304 zł na zestaw w 2030 r. (0,5 etatu i 50 zestawów), 2 916 zł w 2031 r. (1,0 etatu i 79 zestawów), 2 560 zł w 2032 r. (1,5 etatu i 135 zestawów), 1 280 zł w 2033 r. (270 zestawów) i 640 zł w 2034 r. (540 zestawów). Jest to górna granica, bo ten sam specjalista prowadzi także wdrożenia subskrypcji i licencji API. Pełny koszt zestawu ze sprzętem i montażem wynosi więc 7 179 zł w 2030 r., 7 791 zł w 2031 r., 7 435 zł w 2032 r., 6 155 zł w 2033 r. i 5 515 zł w 2034 r. (74% ceny). W latach 2030-2032 jest on bliski ceny albo ją przekracza, bo wolumen sprzedaży jest jeszcze mały wobec stałego kosztu etatu, co jest jedną z przyczyn deficytu w latach 2030-2031. Subskrypcja SaaS (349 zł za pojazd miesięcznie): koszt zmienny wynosi 65,7 zł (hosting 50 zł, marketing 1,5% ceny, czyli 5,2 zł, administracja 3% ceny, czyli 10,5 zł), więc marża zmienna to 81%. Licencja API (4 800 zł rocznie za umowę): koszt zmienny wynosi 696 zł (obsługa 480 zł, marketing 72 zł, administracja 144 zł), więc marża zmienna to 85%. Koszt sprzętu 4 875 zł jest kosztem docelowym zestawu produkcyjnego, zatwierdzonym przez Everest11 do modelu; tylko cena modułu edge AI pochodzi z cennika producenta, a pozostałe ceny komponentów są założeniami dla klasy OEM, które Everest11 potwierdzi ofertami w zadaniu Z7.</w:t>
+        <w:t>Jednostkowy koszt wytworzenia produktów (K2-13). Zestaw retrofit (cena 7 500 zł): koszt sprzętu wynosi 4 875 zł, czyli 65% ceny, jako koszt docelowy zestawu produkcyjnego z jednym modułem kamery ToF, kamery EO i radaru mmWave. Składają się na niego: moduł edge AI Jetson Orin Nano 8 GB 1 520 zł, płyta nośna i integracja 450 zł, kamera ToF 850 zł, kamera EO 380 zł, radar mmWave 430 zł, IMU i czujniki środowiskowe 120 zł, moduł LTE/GNSS 340 zł, dysk NVMe 260 zł oraz obudowa IP66 z okablowaniem i zasilaniem 525 zł. Cena modułu edge AI pochodzi z cennika producenta (399 USD przy zamówieniu od 1000 szt.), a pozostałe ceny to założenia dla modułów klasy OEM, które Everest11 potwierdzi ofertami w zadaniu Z7. W modelu jest to wiersz kosztu własnego sprzętu równy liczbie zestawów razy 4,875 tys. zł (50 x 4,875 = 243,75 tys. zł w 2030 r. i 540 x 4,875 = 2 632,5 tys. zł w 2034 r.). Marża na sprzęcie wynosi 2 625 zł (35% ceny), a przy koszcie wyższym o 1 000 zł spada do 22%. Montaż i uruchomienie u klienta wykonuje specjalista ds. wdrożeń z zespołu komercjalizacji (koszt 230,4 tys. zł rocznie na etat), więc ten koszt jest w wierszu zespołu, a nie w koszcie sprzętu. Przypisany w całości do sprzedanych zestawów wynosi 2 304 zł na zestaw w 2030 r. (0,5 etatu i 50 zestawów), 2 916 zł w 2031 r. (1,0 etatu i 79 zestawów), 2 560 zł w 2032 r. (1,5 etatu i 135 zestawów), 1 280 zł w 2033 r. (270 zestawów) i 640 zł w 2034 r. (540 zestawów). Jest to górna granica, bo ten sam specjalista prowadzi także wdrożenia subskrypcji i licencji API. Pełny koszt zestawu ze sprzętem i montażem wynosi więc 7 179 zł w 2030 r., 7 791 zł w 2031 r., 7 435 zł w 2032 r., 6 155 zł w 2033 r. i 5 515 zł w 2034 r. (74% ceny). W latach 2030-2032 jest on zbliżony do ceny lub nieco ją przekracza (7 791 zł w 2031 r.), bo wolumen sprzedaży jest jeszcze mały wobec stałego kosztu etatu, co jest jedną z przyczyn deficytu w latach 2030-2031. Subskrypcja SaaS (349 zł za pojazd miesięcznie): koszt zmienny wynosi 65,7 zł (hosting 50 zł, marketing 1,5% ceny, czyli 5,2 zł, administracja 3% ceny, czyli 10,5 zł), więc marża zmienna to 81%. Licencja API (4 800 zł rocznie za umowę): koszt zmienny wynosi 696 zł (obsługa 480 zł, marketing 72 zł, administracja 144 zł), więc marża zmienna to 85%.</w:t>
       </w:r>
     </w:p>
     <w:p>

</xml_diff>